<commit_message>
Draft_042: fix Khunasathitchai DOI hanging indent
Merge DOI into the reference paragraph so it indents with the entry.
</commit_message>
<xml_diff>
--- a/thesis/003_ThesisProposal_Draft_042.docx
+++ b/thesis/003_ThesisProposal_Draft_042.docx
@@ -12160,7 +12160,7 @@
           <w:szCs w:val="22"/>
           <w:rtl w:val="0"/>
         </w:rPr>
-        <w:t xml:space="preserve">Khunasathitchai, K., Sittironnarit, S., Sinturat, T., &amp; Kumdee, S. (2025). Move analysis and hedge use in the research paper abstracts of Thai EFL English-majored undergraduates. </w:t>
+        <w:t>Khunasathitchai, K., Sittironnarit, S., Sinturat, T., &amp; Kumdee, S. (2025). Move analysis and hedge use in the research paper abstracts of Thai EFL English-majored undergraduates. rEFLections, 32(2), 951–973. https://doi.org/10.61508/refl.v32i2.282512</w:t>
       </w:r>
       <w:r>
         <w:rPr>
@@ -12173,46 +12173,18 @@
           <w:szCs w:val="22"/>
           <w:rtl w:val="0"/>
         </w:rPr>
-        <w:t>rEFLections, 32(2), 951–973.</w:t>
-      </w:r>
-      <w:r>
-        <w:rPr>
-          <w:rFonts w:ascii="Georgia" w:cs="Georgia" w:eastAsia="Georgia" w:hAnsi="Georgia"/>
-          <w:b w:val="0"/>
-          <w:bCs w:val="0"/>
-          <w:i w:val="0"/>
-          <w:iCs w:val="0"/>
-          <w:sz w:val="22"/>
-          <w:szCs w:val="22"/>
-          <w:rtl w:val="0"/>
-        </w:rPr>
-        <w:t/>
-      </w:r>
-      <w:r>
-        <w:rPr>
-          <w:rtl w:val="0"/>
-        </w:rPr>
-      </w:r>
-    </w:p>
-    <w:p>
-      <w:pPr>
-        <w:spacing w:before="0" w:after="0" w:line="480" w:lineRule="auto"/>
-        <w:ind w:left="720" w:hanging="720"/>
-        <w:jc w:val="both"/>
-        <w:rPr/>
-      </w:pPr>
-      <w:r>
-        <w:rPr>
-          <w:rFonts w:ascii="Georgia" w:cs="Georgia" w:eastAsia="Georgia" w:hAnsi="Georgia"/>
-          <w:b w:val="0"/>
-          <w:bCs w:val="0"/>
-          <w:i w:val="0"/>
-          <w:iCs w:val="0"/>
-          <w:sz w:val="22"/>
-          <w:szCs w:val="22"/>
-          <w:rtl w:val="0"/>
-        </w:rPr>
-        <w:t>https://doi.org/10.61508/refl.v32i2.282512</w:t>
+      </w:r>
+      <w:r>
+        <w:rPr>
+          <w:rFonts w:ascii="Georgia" w:cs="Georgia" w:eastAsia="Georgia" w:hAnsi="Georgia"/>
+          <w:b w:val="0"/>
+          <w:bCs w:val="0"/>
+          <w:i w:val="0"/>
+          <w:iCs w:val="0"/>
+          <w:sz w:val="22"/>
+          <w:szCs w:val="22"/>
+          <w:rtl w:val="0"/>
+        </w:rPr>
       </w:r>
       <w:r>
         <w:rPr>

</xml_diff>